<commit_message>
DOI-Pruefung: alle 19 Referenzen der Vergleichsuebersicht verifiziert
- 18/19 exakt bestaetigt (Crossref-Abgleich: Titel, Journal, Band,
  Seiten, Jahr, Erstautoren); Pruefvermerk im Dokument ergaenzt
- Korrektur PCMO-OER-Paper: Lole et al., JPCC 127, 177-186 (2023)
  statt Band 126 (2022) - in Vergleich und PCMO-Lynen-Antrag behoben

Co-Authored-By: Claude Fable 5 <noreply@anthropic.com>
</commit_message>
<xml_diff>
--- a/Material_2_PCMO_PrCaMnO3/FeodorLynen_PCMO_EN.docx
+++ b/Material_2_PCMO_PrCaMnO3/FeodorLynen_PCMO_EN.docx
@@ -398,15 +398,7 @@
                 <w:sz w:val="19"/>
                 <w:szCs w:val="19"/>
               </w:rPr>
-              <w:t xml:space="preserve">Prof. Dr. William C. Chueh, Department of Materials Science and Engineering, Stanford University, USA – </w:t>
-            </w:r>
-            <w:r>
-              <w:rPr>
-                <w:rFonts w:ascii="Arial" w:eastAsia="Times New Roman" w:hAnsi="Arial" w:cs="Arial"/>
-                <w:sz w:val="19"/>
-                <w:szCs w:val="19"/>
-              </w:rPr>
-              <w:t>Friedrich Wilhelm Bessel Research Award winner of the AvH Foundation (2021), member of the Humboldt Network</w:t>
+              <w:t>Prof. Dr. William C. Chueh, Department of Materials Science and Engineering, Stanford University, USA – Friedrich Wilhelm Bessel Research Award winner of the AvH Foundation (2021), member of the Humboldt Network</w:t>
             </w:r>
           </w:p>
         </w:tc>
@@ -845,15 +837,7 @@
           <w:sz w:val="21"/>
           <w:szCs w:val="21"/>
         </w:rPr>
-        <w:t xml:space="preserve"> </w:t>
-      </w:r>
-      <w:r>
-        <w:rPr>
-          <w:rFonts w:ascii="Arial" w:hAnsi="Arial" w:cs="Arial"/>
-          <w:sz w:val="21"/>
-          <w:szCs w:val="21"/>
-        </w:rPr>
-        <w:t>determines the central figures of merit (ON/OFF ratio, forming voltage, retention). Energy research, by contrast, has quantitatively established that E</w:t>
+        <w:t xml:space="preserve"> determines the central figures of merit (ON/OFF ratio, forming voltage, retention). Energy research, by contrast, has quantitatively established that E</w:t>
       </w:r>
       <w:r>
         <w:rPr>
@@ -1043,15 +1027,7 @@
           <w:sz w:val="21"/>
           <w:szCs w:val="21"/>
         </w:rPr>
-        <w:t xml:space="preserve"> system; the resulting increase of Mn3d–O2p hybridisation with x is directly measurable at the O-K edge and has recently been quantified across the PCMO series in the electrocatalysis context [9] – </w:t>
-      </w:r>
-      <w:r>
-        <w:rPr>
-          <w:rFonts w:ascii="Arial" w:hAnsi="Arial" w:cs="Arial"/>
-          <w:sz w:val="21"/>
-          <w:szCs w:val="21"/>
-        </w:rPr>
-        <w:t xml:space="preserve">precisely the descriptor knowledge this project transfers to memristive switching, with the classic manganite X-ray absorption literature as calibration base [10, 11]. </w:t>
+        <w:t xml:space="preserve"> system; the resulting increase of Mn3d–O2p hybridisation with x is directly measurable at the O-K edge and has recently been quantified across the PCMO series in the electrocatalysis context [9] – precisely the descriptor knowledge this project transfers to memristive switching, with the classic manganite X-ray absorption literature as calibration base [10, 11]. </w:t>
       </w:r>
       <w:r>
         <w:rPr>
@@ -1156,15 +1132,7 @@
           <w:sz w:val="21"/>
           <w:szCs w:val="21"/>
         </w:rPr>
-        <w:t xml:space="preserve"> </w:t>
-      </w:r>
-      <w:r>
-        <w:rPr>
-          <w:rFonts w:ascii="Arial" w:hAnsi="Arial" w:cs="Arial"/>
-          <w:sz w:val="21"/>
-          <w:szCs w:val="21"/>
-        </w:rPr>
-        <w:t xml:space="preserve">PCMO remains a perovskite and stays insulating over the entire doping range (narrow bandwidth) – no topotactic brownmillerite transition and no metal–insulator transition interferes, in deliberate contrast to the ferrite and cobaltite families, where the switching mechanism itself changes with doping. Covalency thus remains the truly isolated variable. My central hypothesis: the Asanuma optimum </w:t>
+        <w:t xml:space="preserve"> PCMO remains a perovskite and stays insulating over the entire doping range (narrow bandwidth) – no topotactic brownmillerite transition and no metal–insulator transition interferes, in deliberate contrast to the ferrite and cobaltite families, where the switching mechanism itself changes with doping. Covalency thus remains the truly isolated variable. My central hypothesis: the Asanuma optimum </w:t>
       </w:r>
       <w:r>
         <w:rPr>
@@ -1182,15 +1150,7 @@
           <w:sz w:val="21"/>
           <w:szCs w:val="21"/>
         </w:rPr>
-        <w:t xml:space="preserve"> the covalency optimum (“Goldilocks zone”) – </w:t>
-      </w:r>
-      <w:r>
-        <w:rPr>
-          <w:rFonts w:ascii="Arial" w:hAnsi="Arial" w:cs="Arial"/>
-          <w:sz w:val="21"/>
-          <w:szCs w:val="21"/>
-        </w:rPr>
-        <w:t>and its position can be predicted from an experimentally measured XAS covalency descriptor. This project adds the missing descriptor axis to the established switching axis; related composition series [15, 17] serve as consistency checks.</w:t>
+        <w:t xml:space="preserve"> the covalency optimum (“Goldilocks zone”) – and its position can be predicted from an experimentally measured XAS covalency descriptor. This project adds the missing descriptor axis to the established switching axis; related composition series [15, 17] serve as consistency checks.</w:t>
       </w:r>
     </w:p>
     <w:p>
@@ -1222,15 +1182,7 @@
           <w:sz w:val="21"/>
           <w:szCs w:val="21"/>
         </w:rPr>
-        <w:t>The group of Prof. William Chueh is a world leader in exactly the combination this project requires: defect chemistry and non-stoichiometry of redox-active oxides, quantitative operando X-ray absorption spectroscopy at the in-house Stanford Synchrotron Radiation Lightsource (SSRL), and redox chemistry of epitaxial perovskite thin films [18–20]. The group’</w:t>
-      </w:r>
-      <w:r>
-        <w:rPr>
-          <w:rFonts w:ascii="Arial" w:hAnsi="Arial" w:cs="Arial"/>
-          <w:sz w:val="21"/>
-          <w:szCs w:val="21"/>
-        </w:rPr>
-        <w:t>s seminal work on the redox activity of oxygen anions in oxygen-deficient perovskites [19] is a direct methodological blueprint for my project; the Nature Materials study on atomically defined LaNiO</w:t>
+        <w:t>The group of Prof. William Chueh is a world leader in exactly the combination this project requires: defect chemistry and non-stoichiometry of redox-active oxides, quantitative operando X-ray absorption spectroscopy at the in-house Stanford Synchrotron Radiation Lightsource (SSRL), and redox chemistry of epitaxial perovskite thin films [18–20]. The group’s seminal work on the redox activity of oxygen anions in oxygen-deficient perovskites [19] is a direct methodological blueprint for my project; the Nature Materials study on atomically defined LaNiO</w:t>
       </w:r>
       <w:r>
         <w:rPr>
@@ -1247,39 +1199,7 @@
           <w:sz w:val="21"/>
           <w:szCs w:val="21"/>
         </w:rPr>
-        <w:t xml:space="preserve"> surfaces [20] – with Christoph Baeumer from the Jülich school as first author – </w:t>
-      </w:r>
-      <w:r>
-        <w:rPr>
-          <w:rFonts w:ascii="Arial" w:hAnsi="Arial" w:cs="Arial"/>
-          <w:sz w:val="21"/>
-          <w:szCs w:val="21"/>
-        </w:rPr>
-        <w:t>furthermore demonstrates that the group routinely masters epitaxial perovskite model systems of the type proposed here and successfully integrates German postdocs. Direct SSRL access makes XAS campaigns plannable that in Europe cost months of lead time through competitive single proposals. Complementarily, I contribute the device side, from which the Stanford environment profits in turn: PLD process development, memristive device processing and statistically robust switching characterisation from five years</w:t>
-      </w:r>
-      <w:r>
-        <w:rPr>
-          <w:rFonts w:ascii="Arial" w:hAnsi="Arial" w:cs="Arial"/>
-          <w:sz w:val="21"/>
-          <w:szCs w:val="21"/>
-        </w:rPr>
-        <w:t xml:space="preserve"> at the Peter Gr</w:t>
-      </w:r>
-      <w:r>
-        <w:rPr>
-          <w:rFonts w:ascii="Arial" w:hAnsi="Arial" w:cs="Arial"/>
-          <w:sz w:val="21"/>
-          <w:szCs w:val="21"/>
-        </w:rPr>
-        <w:t>ünberg Institute (PGI-7, group of Prof. Dittmann) – acquired on PCMO itself, the very material of this proposal [E1–E3]. This is the strongest possible de-risking for a 24-month project: growth windows, device processing and measurement protocols for PCMO are my established expertise, so the fellowship time is spent on the genuinely new element – the spectroscopic descriptor axis. The constellation is thus a genuine two-way transfer of knowledge. For complementary epitaxial growth questions, the env</w:t>
-      </w:r>
-      <w:r>
-        <w:rPr>
-          <w:rFonts w:ascii="Arial" w:hAnsi="Arial" w:cs="Arial"/>
-          <w:sz w:val="21"/>
-          <w:szCs w:val="21"/>
-        </w:rPr>
-        <w:t>ironment of the Stanford Institute for Materials and Energy Sciences (SIMES) at SLAC is available. As a Bessel Research Award winner (2021), Prof. Chueh is a member of the Humboldt Network and has repeatedly hosted German postdocs – the host eligibility required by the programme is given.</w:t>
+        <w:t xml:space="preserve"> surfaces [20] – with Christoph Baeumer from the Jülich school as first author – furthermore demonstrates that the group routinely masters epitaxial perovskite model systems of the type proposed here and successfully integrates German postdocs. Direct SSRL access makes XAS campaigns plannable that in Europe cost months of lead time through competitive single proposals. Complementarily, I contribute the device side, from which the Stanford environment profits in turn: PLD process development, memristive device processing and statistically robust switching characterisation from five years at the Peter Grünberg Institute (PGI-7, group of Prof. Dittmann) – acquired on PCMO itself, the very material of this proposal [E1–E3]. This is the strongest possible de-risking for a 24-month project: growth windows, device processing and measurement protocols for PCMO are my established expertise, so the fellowship time is spent on the genuinely new element – the spectroscopic descriptor axis. The constellation is thus a genuine two-way transfer of knowledge. For complementary epitaxial growth questions, the environment of the Stanford Institute for Materials and Energy Sciences (SIMES) at SLAC is available. As a Bessel Research Award winner (2021), Prof. Chueh is a member of the Humboldt Network and has repeatedly hosted German postdocs – the host eligibility required by the programme is given.</w:t>
       </w:r>
     </w:p>
     <w:p>
@@ -1376,15 +1296,7 @@
           <w:sz w:val="21"/>
           <w:szCs w:val="21"/>
         </w:rPr>
-        <w:t xml:space="preserve"> films (x = 0.1; 0.2; 0.3; 0.4; 0.5; 0.65; 0.8 – </w:t>
-      </w:r>
-      <w:r>
-        <w:rPr>
-          <w:rFonts w:ascii="Arial" w:hAnsi="Arial" w:cs="Arial"/>
-          <w:sz w:val="21"/>
-          <w:szCs w:val="21"/>
-        </w:rPr>
-        <w:t>dense sampling around the reported switching optimum at x ≈ 0.4 and up to the x &gt; 0.8 regime where switching reportedly vanishes [16]) on Nb:SrTiO</w:t>
+        <w:t xml:space="preserve"> films (x = 0.1; 0.2; 0.3; 0.4; 0.5; 0.65; 0.8 – dense sampling around the reported switching optimum at x ≈ 0.4 and up to the x &gt; 0.8 regime where switching reportedly vanishes [16]) on Nb:SrTiO</w:t>
       </w:r>
       <w:r>
         <w:rPr>
@@ -1401,15 +1313,7 @@
           <w:sz w:val="21"/>
           <w:szCs w:val="21"/>
         </w:rPr>
-        <w:t xml:space="preserve"> substrates in the Stanford/SLAC thin-film laboratories, building directly on my PCMO growth expertise [E1–</w:t>
-      </w:r>
-      <w:r>
-        <w:rPr>
-          <w:rFonts w:ascii="Arial" w:hAnsi="Arial" w:cs="Arial"/>
-          <w:sz w:val="21"/>
-          <w:szCs w:val="21"/>
-        </w:rPr>
-        <w:t>E3]; structural validation (XRD, AFM); cation and oxygen stoichiometry (XPS, RBS where required). In parallel, first XAS campaign at SSRL: O-K pre-edge quantification following the procedure of Suntivich et al. [11], benchmarked against the published PCMO covalence analysis [9], and Mn-L</w:t>
+        <w:t xml:space="preserve"> substrates in the Stanford/SLAC thin-film laboratories, building directly on my PCMO growth expertise [E1–E3]; structural validation (XRD, AFM); cation and oxygen stoichiometry (XPS, RBS where required). In parallel, first XAS campaign at SSRL: O-K pre-edge quantification following the procedure of Suntivich et al. [11], benchmarked against the published PCMO covalence analysis [9], and Mn-L</w:t>
       </w:r>
       <w:r>
         <w:rPr>
@@ -1450,13 +1354,7 @@
         <w:rPr>
           <w:rFonts w:ascii="Arial" w:eastAsia="Times New Roman" w:hAnsi="Arial" w:cs="Arial"/>
         </w:rPr>
-        <w:t>WP2 – Devices and switching characterisation (months 8–</w:t>
-      </w:r>
-      <w:r>
-        <w:rPr>
-          <w:rFonts w:ascii="Arial" w:eastAsia="Times New Roman" w:hAnsi="Arial" w:cs="Arial"/>
-        </w:rPr>
-        <w:t>18)</w:t>
+        <w:t>WP2 – Devices and switching characterisation (months 8–18)</w:t>
       </w:r>
     </w:p>
     <w:p>
@@ -1603,15 +1501,7 @@
           <w:sz w:val="21"/>
           <w:szCs w:val="21"/>
         </w:rPr>
-        <w:t xml:space="preserve"> </w:t>
-      </w:r>
-      <w:r>
-        <w:rPr>
-          <w:rFonts w:ascii="Arial" w:hAnsi="Arial" w:cs="Arial"/>
-          <w:sz w:val="21"/>
-          <w:szCs w:val="21"/>
-        </w:rPr>
-        <w:t xml:space="preserve">dynamics. Publication of the first covalency-resolved memristor study of a perovskite series; dataset released following FAIR principles. </w:t>
+        <w:t xml:space="preserve"> dynamics. Publication of the first covalency-resolved memristor study of a perovskite series; dataset released following FAIR principles. </w:t>
       </w:r>
       <w:r>
         <w:rPr>
@@ -2957,39 +2847,7 @@
           <w:sz w:val="21"/>
           <w:szCs w:val="21"/>
         </w:rPr>
-        <w:t xml:space="preserve">The project is the deliberate building block between my doctorate (memristive devices, PLD, switching statistics) and my longer-term goal of establishing my own junior research group in Germany on descriptor-based materials development for memristive oxides (Emmy Noether proposal in preparation; ERC Starting Grant as an alternative). The stay with Prof. Chueh closes the one competence gap of my profile – quantitative synchrotron XAS and defect thermodynamics – </w:t>
-      </w:r>
-      <w:r>
-        <w:rPr>
-          <w:rFonts w:ascii="Arial" w:hAnsi="Arial" w:cs="Arial"/>
-          <w:sz w:val="21"/>
-          <w:szCs w:val="21"/>
-        </w:rPr>
-        <w:t xml:space="preserve">and at the same time delivers the empirical foundation (the covalency-resolved PCMO dataset) for the larger programme of a “treasure map” </w:t>
-      </w:r>
-      <w:r>
-        <w:rPr>
-          <w:rFonts w:ascii="Arial" w:hAnsi="Arial" w:cs="Arial"/>
-          <w:sz w:val="21"/>
-          <w:szCs w:val="21"/>
-        </w:rPr>
-        <w:t>of memristive oxides in analogy to the bonding-descriptor maps of Wuttig et al. [21]. The choice of the mechanism-stable PCMO family for this fellowship is deliberate: it de-risks the descriptor methodology on the cleanest possible system; the subsequent group programme then scales it to the ferrite and cobaltite families, where topotactic phase transitions are no longer a confounder but become chartable mechanism boundaries on the map. The return is concretely planned: reintegration into the German oxide-e</w:t>
-      </w:r>
-      <w:r>
-        <w:rPr>
-          <w:rFonts w:ascii="Arial" w:hAnsi="Arial" w:cs="Arial"/>
-          <w:sz w:val="21"/>
-          <w:szCs w:val="21"/>
-        </w:rPr>
-        <w:t>lectronics environment (FZ J</w:t>
-      </w:r>
-      <w:r>
-        <w:rPr>
-          <w:rFonts w:ascii="Arial" w:hAnsi="Arial" w:cs="Arial"/>
-          <w:sz w:val="21"/>
-          <w:szCs w:val="21"/>
-        </w:rPr>
-        <w:t>ülich/RWTH Aachen, JARA), supported by the Feodor Lynen Return Fellowship, with submission of the group proposal during the final year of the stay. The Stanford/SSRL collaboration built up abroad will be continued as the transatlantic bridge of the future group.</w:t>
+        <w:t>The project is the deliberate building block between my doctorate (memristive devices, PLD, switching statistics) and my longer-term goal of establishing my own junior research group in Germany on descriptor-based materials development for memristive oxides (Emmy Noether proposal in preparation; ERC Starting Grant as an alternative). The stay with Prof. Chueh closes the one competence gap of my profile – quantitative synchrotron XAS and defect thermodynamics – and at the same time delivers the empirical foundation (the covalency-resolved PCMO dataset) for the larger programme of a “treasure map” of memristive oxides in analogy to the bonding-descriptor maps of Wuttig et al. [21]. The choice of the mechanism-stable PCMO family for this fellowship is deliberate: it de-risks the descriptor methodology on the cleanest possible system; the subsequent group programme then scales it to the ferrite and cobaltite families, where topotactic phase transitions are no longer a confounder but become chartable mechanism boundaries on the map. The return is concretely planned: reintegration into the German oxide-electronics environment (FZ Jülich/RWTH Aachen, JARA), supported by the Feodor Lynen Return Fellowship, with submission of the group proposal during the final year of the stay. The Stanford/SSRL collaboration built up abroad will be continued as the transatlantic bridge of the future group.</w:t>
       </w:r>
     </w:p>
     <w:p>
@@ -3043,15 +2901,7 @@
           <w:sz w:val="18"/>
           <w:szCs w:val="18"/>
         </w:rPr>
-        <w:t xml:space="preserve">[2] R. Waser, R. Dittmann, G. Staikov, K. Szot, Redox-Based Resistive Switching Memories – </w:t>
-      </w:r>
-      <w:r>
-        <w:rPr>
-          <w:rFonts w:ascii="Arial" w:hAnsi="Arial" w:cs="Arial"/>
-          <w:sz w:val="18"/>
-          <w:szCs w:val="18"/>
-        </w:rPr>
-        <w:t>Nanoionic Mechanisms, Prospects, and Challenges. Advanced Materials 21, 2632–2663 (2009).</w:t>
+        <w:t>[2] R. Waser, R. Dittmann, G. Staikov, K. Szot, Redox-Based Resistive Switching Memories – Nanoionic Mechanisms, Prospects, and Challenges. Advanced Materials 21, 2632–2663 (2009).</w:t>
       </w:r>
     </w:p>
     <w:p>
@@ -3151,15 +3001,7 @@
           <w:sz w:val="18"/>
           <w:szCs w:val="18"/>
         </w:rPr>
-        <w:t>[7] A. M. Deml, V. Stevanović, C. L. Muhich, C. B. Musgrave, R. O’</w:t>
-      </w:r>
-      <w:r>
-        <w:rPr>
-          <w:rFonts w:ascii="Arial" w:hAnsi="Arial" w:cs="Arial"/>
-          <w:sz w:val="18"/>
-          <w:szCs w:val="18"/>
-        </w:rPr>
-        <w:t>Hayre, Oxide enthalpy of formation and band gap energy as accurate descriptors of oxygen vacancy formation energetics. Energy &amp; Environmental Science 7, 1996–2004 (2014).</w:t>
+        <w:t>[7] A. M. Deml, V. Stevanović, C. L. Muhich, C. B. Musgrave, R. O’Hayre, Oxide enthalpy of formation and band gap energy as accurate descriptors of oxygen vacancy formation energetics. Energy &amp; Environmental Science 7, 1996–2004 (2014).</w:t>
       </w:r>
     </w:p>
     <w:p>
@@ -3250,15 +3092,23 @@
           <w:sz w:val="18"/>
           <w:szCs w:val="18"/>
         </w:rPr>
-        <w:t xml:space="preserve"> </w:t>
-      </w:r>
-      <w:r>
-        <w:rPr>
-          <w:rFonts w:ascii="Arial" w:hAnsi="Arial" w:cs="Arial"/>
-          <w:sz w:val="18"/>
-          <w:szCs w:val="18"/>
-        </w:rPr>
-        <w:t>OER Catalysts with Different Valences and Covalences. Journal of Physical Chemistry C 126 (2022), DOI 10.1021/acs.jpcc.2c05622 [complete author list before submission].</w:t>
+        <w:t xml:space="preserve"> OER Catalysts with Different Valences and Covalences. </w:t>
+      </w:r>
+      <w:r>
+        <w:rPr>
+          <w:rFonts w:ascii="Arial" w:hAnsi="Arial" w:cs="Arial"/>
+          <w:sz w:val="18"/>
+          <w:szCs w:val="18"/>
+        </w:rPr>
+        <w:t>The Journal of Physical Chemistry C 127, 177-186 (2023; online 2022), DOI 10.1021/acs.jpcc.2c05622. Lole, Ebrahimi, Meyer et al. [verify full author list]</w:t>
+      </w:r>
+      <w:r>
+        <w:rPr>
+          <w:rFonts w:ascii="Arial" w:hAnsi="Arial" w:cs="Arial"/>
+          <w:sz w:val="18"/>
+          <w:szCs w:val="18"/>
+        </w:rPr>
+        <w:t>.</w:t>
       </w:r>
     </w:p>
     <w:p>
@@ -3582,15 +3432,7 @@
           <w:sz w:val="18"/>
           <w:szCs w:val="18"/>
         </w:rPr>
-        <w:t xml:space="preserve"> </w:t>
-      </w:r>
-      <w:r>
-        <w:rPr>
-          <w:rFonts w:ascii="Arial" w:hAnsi="Arial" w:cs="Arial"/>
-          <w:sz w:val="18"/>
-          <w:szCs w:val="18"/>
-        </w:rPr>
-        <w:t>films. Thin Solid Films 529, 352–355 (2013).</w:t>
+        <w:t xml:space="preserve"> films. Thin Solid Films 529, 352–355 (2013).</w:t>
       </w:r>
     </w:p>
     <w:p>
@@ -3934,15 +3776,7 @@
           <w:sz w:val="18"/>
           <w:szCs w:val="18"/>
         </w:rPr>
-        <w:t xml:space="preserve"> </w:t>
-      </w:r>
-      <w:r>
-        <w:rPr>
-          <w:rFonts w:ascii="Arial" w:hAnsi="Arial" w:cs="Arial"/>
-          <w:sz w:val="18"/>
-          <w:szCs w:val="18"/>
-        </w:rPr>
-        <w:t>for Area-Dependent Resistive Switching Devices. Advanced Electronic Materials (2026, accepted).</w:t>
+        <w:t xml:space="preserve"> for Area-Dependent Resistive Switching Devices. Advanced Electronic Materials (2026, accepted).</w:t>
       </w:r>
     </w:p>
     <w:p>
@@ -4767,15 +4601,7 @@
           <w:sz w:val="21"/>
           <w:szCs w:val="21"/>
         </w:rPr>
-        <w:t>Base fellowship € 2,187.50/month (minus host contribution) + foreign allowance USA (€ 1,892 single or € 2,528–</w:t>
-      </w:r>
-      <w:r>
-        <w:rPr>
-          <w:rFonts w:ascii="Arial" w:hAnsi="Arial" w:cs="Arial"/>
-          <w:sz w:val="21"/>
-          <w:szCs w:val="21"/>
-        </w:rPr>
-        <w:t>2,807 with family) + research cost allowance € 312.50/month + travel lump sums; family benefits (partner allowance € 205, child allowance € 400/100); afterwards optionally the Feodor Lynen Return Fellowship (up to 12 months, € 3,600/month) to bridge until group funding. Applications accepted at any time; selection meetings February/June/October; success rate approx. 40 %.</w:t>
+        <w:t>Base fellowship € 2,187.50/month (minus host contribution) + foreign allowance USA (€ 1,892 single or € 2,528–2,807 with family) + research cost allowance € 312.50/month + travel lump sums; family benefits (partner allowance € 205, child allowance € 400/100); afterwards optionally the Feodor Lynen Return Fellowship (up to 12 months, € 3,600/month) to bridge until group funding. Applications accepted at any time; selection meetings February/June/October; success rate approx. 40 %.</w:t>
       </w:r>
     </w:p>
     <w:sectPr>

</xml_diff>